<commit_message>
Revertir error aritmético: 65,000 UMA = $7,625,150 en kits inmobiliaria y notarial
Co-Authored-By: Claude Sonnet 5.5 <noreply@anthropic.com>
Claude-Session: https://claude.ai/code/session_01DVRJGYPU9dF2qt9pnwiF1P
</commit_message>
<xml_diff>
--- a/plantillas/inmobiliaria/D4_Gap_Analysis_PLD_v3.docx
+++ b/plantillas/inmobiliaria/D4_Gap_Analysis_PLD_v3.docx
@@ -1856,7 +1856,7 @@
                 <w:sz w:val="16"/>
                 <w:szCs w:val="16"/>
               </w:rPr>
-              <w:t xml:space="preserve">$7,624,150</w:t>
+              <w:t xml:space="preserve">$7,625,150</w:t>
             </w:r>
           </w:p>
         </w:tc>
@@ -1990,7 +1990,7 @@
                 <w:sz w:val="16"/>
                 <w:szCs w:val="16"/>
               </w:rPr>
-              <w:t xml:space="preserve">$7,624,150</w:t>
+              <w:t xml:space="preserve">$7,625,150</w:t>
             </w:r>
           </w:p>
         </w:tc>
@@ -3196,7 +3196,7 @@
                 <w:sz w:val="16"/>
                 <w:szCs w:val="16"/>
               </w:rPr>
-              <w:t xml:space="preserve">$7,624,150</w:t>
+              <w:t xml:space="preserve">$7,625,150</w:t>
             </w:r>
           </w:p>
         </w:tc>
@@ -3214,7 +3214,7 @@
           <w:sz w:val="19"/>
           <w:szCs w:val="19"/>
         </w:rPr>
-        <w:t xml:space="preserve">C = Cumple · P = Parcial · N = No cumple · V/A/R = semáforo Verde/Amarillo/Rojo. (*) = rubro de nueva incorporación conforme al Acuerdo 115/2026. Multas máximas del Art. 54 de la Ley con UMA 2026 ($117.31): 2,000 UMA = $234,620 (infracciones al Art. 18); 65,000 UMA = $7,624,150 (omisión de Avisos y operaciones prohibidas en efectivo), o 10%–100% del valor del acto si resulta mayor.</w:t>
+        <w:t xml:space="preserve">C = Cumple · P = Parcial · N = No cumple · V/A/R = semáforo Verde/Amarillo/Rojo. (*) = rubro de nueva incorporación conforme al Acuerdo 115/2026. Multas máximas del Art. 54 de la Ley con UMA 2026 ($117.31): 2,000 UMA = $234,620 (infracciones al Art. 18); 65,000 UMA = $7,625,150 (omisión de Avisos y operaciones prohibidas en efectivo), o 10%–100% del valor del acto si resulta mayor.</w:t>
       </w:r>
     </w:p>
     <w:p>

</xml_diff>